<commit_message>
build: regenerate assignment ipynb and docx after lecture renumbering
Regenerate notebook and Word formats for assignments 04-10 from
their renumbered .qmd sources, so all three deliverables reference
the new lecture numbers consistently.

Also gitignore the local copy of the semester-transition guide.
</commit_message>
<xml_diff>
--- a/assignments/05-assignment.docx
+++ b/assignments/05-assignment.docx
@@ -50,7 +50,7 @@
           <w:b/>
           <w:bCs/>
         </w:rPr>
-        <w:t xml:space="preserve">Lecture 10</w:t>
+        <w:t xml:space="preserve">Lecture 11</w:t>
       </w:r>
       <w:r>
         <w:t xml:space="preserve">: Creativity and Hallucination and</w:t>
@@ -63,7 +63,7 @@
           <w:b/>
           <w:bCs/>
         </w:rPr>
-        <w:t xml:space="preserve">Lecture 11</w:t>
+        <w:t xml:space="preserve">Lecture 12</w:t>
       </w:r>
       <w:r>
         <w:t xml:space="preserve">: RAG, Semantic Search, and Grounding AI.</w:t>
@@ -290,7 +290,7 @@
         <w:pStyle w:val="FirstParagraph"/>
       </w:pPr>
       <w:r>
-        <w:t xml:space="preserve">Lecture 10 explained that for rare topics, LLMs</w:t>
+        <w:t xml:space="preserve">Lecture 11 explained that for rare topics, LLMs</w:t>
       </w:r>
       <w:r>
         <w:t xml:space="preserve"> </w:t>
@@ -690,7 +690,7 @@
         <w:pStyle w:val="FirstParagraph"/>
       </w:pPr>
       <w:r>
-        <w:t xml:space="preserve">Lecture 10 presented three categories of real-world hallucination failures:</w:t>
+        <w:t xml:space="preserve">Lecture 11 presented three categories of real-world hallucination failures:</w:t>
       </w:r>
       <w:r>
         <w:t xml:space="preserve"> </w:t>
@@ -941,7 +941,7 @@
         <w:pStyle w:val="FirstParagraph"/>
       </w:pPr>
       <w:r>
-        <w:t xml:space="preserve">Lecture 10 showed that hallucination rates vary dramatically by domain. Common knowledge is low risk; obscure history and legal/medical content are high risk.</w:t>
+        <w:t xml:space="preserve">Lecture 11 showed that hallucination rates vary dramatically by domain. Common knowledge is low risk; obscure history and legal/medical content are high risk.</w:t>
       </w:r>
     </w:p>
     <w:p>
@@ -1248,7 +1248,7 @@
         </w:numPr>
       </w:pPr>
       <w:r>
-        <w:t xml:space="preserve">Lecture 10 stated that GPT-4 hallucinated on ~29% of common references but ~58% on legal questions (Dahl et al. 2024). Based on your test, why do you think specialised domains have higher hallucination rates?</w:t>
+        <w:t xml:space="preserve">Lecture 11 stated that GPT-4 hallucinated on ~29% of common references but ~58% on legal questions (Dahl et al. 2024). Based on your test, why do you think specialised domains have higher hallucination rates?</w:t>
       </w:r>
     </w:p>
     <w:p>
@@ -1418,7 +1418,7 @@
         <w:t xml:space="preserve">sycophancy</w:t>
       </w:r>
       <w:r>
-        <w:t xml:space="preserve">, discussed in Lecture 10). Imagine millions of people using AI assistants that confirm their existing beliefs instead of challenging them.</w:t>
+        <w:t xml:space="preserve">, discussed in Lecture 11). Imagine millions of people using AI assistants that confirm their existing beliefs instead of challenging them.</w:t>
       </w:r>
     </w:p>
     <w:p>

</xml_diff>

<commit_message>
fix(assignments): harden A05 Q2 constraints and run bare V0 in Q3
- Q2: five constraints, same prompt run three times, variance analysis
- Q3: V0 sent alone so the vague prompt produces a visibly vague output
</commit_message>
<xml_diff>
--- a/assignments/05-assignment.docx
+++ b/assignments/05-assignment.docx
@@ -889,7 +889,7 @@
         <w:pStyle w:val="FirstParagraph"/>
       </w:pPr>
       <w:r>
-        <w:t xml:space="preserve">Lecture 10 said the Format element tells the model exactly how the output should look. This question tests how many constraints a model can hold at once, and how you fix a prompt when it drops one.</w:t>
+        <w:t xml:space="preserve">Lecture 10 said the Format element tells the model exactly how the output should look. This question tests how many constraints a model can hold at once, and whether it holds them every time.</w:t>
       </w:r>
     </w:p>
     <w:p>
@@ -913,7 +913,7 @@
         </w:numPr>
       </w:pPr>
       <w:r>
-        <w:t xml:space="preserve">Open a new chat. Write a prompt asking the model for a paragraph explaining what an AI hallucination is. Your prompt must state these four constraints, in your own words:</w:t>
+        <w:t xml:space="preserve">Open a new chat. Write a prompt asking the model for a paragraph explaining what an AI hallucination is. Your prompt must state these five constraints, in your own words:</w:t>
       </w:r>
     </w:p>
     <w:p>
@@ -925,7 +925,7 @@
         </w:numPr>
       </w:pPr>
       <w:r>
-        <w:t xml:space="preserve">Exactly 40 words</w:t>
+        <w:t xml:space="preserve">Exactly 30 words</w:t>
       </w:r>
     </w:p>
     <w:p>
@@ -955,7 +955,13 @@
         </w:numPr>
       </w:pPr>
       <w:r>
-        <w:t xml:space="preserve">Mentions a fruit</w:t>
+        <w:t xml:space="preserve">Never uses the letter</w:t>
+      </w:r>
+      <w:r>
+        <w:t xml:space="preserve"> </w:t>
+      </w:r>
+      <w:r>
+        <w:t xml:space="preserve">“a”</w:t>
       </w:r>
     </w:p>
     <w:p>
@@ -967,6 +973,18 @@
         </w:numPr>
       </w:pPr>
       <w:r>
+        <w:t xml:space="preserve">Mentions a fruit</w:t>
+      </w:r>
+    </w:p>
+    <w:p>
+      <w:pPr>
+        <w:pStyle w:val="Compact"/>
+        <w:numPr>
+          <w:ilvl w:val="1"/>
+          <w:numId w:val="1006"/>
+        </w:numPr>
+      </w:pPr>
+      <w:r>
         <w:t xml:space="preserve">Ends with a question</w:t>
       </w:r>
     </w:p>
@@ -979,13 +997,25 @@
         </w:numPr>
       </w:pPr>
       <w:r>
-        <w:t xml:space="preserve">Copy the response. Count the words yourself, and search for the letter</w:t>
+        <w:t xml:space="preserve">Copy the response. Count the words yourself, and search for</w:t>
       </w:r>
       <w:r>
         <w:t xml:space="preserve"> </w:t>
       </w:r>
       <w:r>
         <w:t xml:space="preserve">“e”</w:t>
+      </w:r>
+      <w:r>
+        <w:t xml:space="preserve"> </w:t>
+      </w:r>
+      <w:r>
+        <w:t xml:space="preserve">and</w:t>
+      </w:r>
+      <w:r>
+        <w:t xml:space="preserve"> </w:t>
+      </w:r>
+      <w:r>
+        <w:t xml:space="preserve">“a”</w:t>
       </w:r>
       <w:r>
         <w:t xml:space="preserve"> </w:t>
@@ -1003,7 +1033,35 @@
         </w:numPr>
       </w:pPr>
       <w:r>
-        <w:t xml:space="preserve">If any constraint failed, change your prompt and try again, up to three attempts in total. Keep every prompt and every response.</w:t>
+        <w:t xml:space="preserve">Open two more new chats and send the</w:t>
+      </w:r>
+      <w:r>
+        <w:t xml:space="preserve"> </w:t>
+      </w:r>
+      <w:r>
+        <w:rPr>
+          <w:b/>
+          <w:bCs/>
+        </w:rPr>
+        <w:t xml:space="preserve">same prompt</w:t>
+      </w:r>
+      <w:r>
+        <w:t xml:space="preserve"> </w:t>
+      </w:r>
+      <w:r>
+        <w:t xml:space="preserve">again in each, so you have three responses to one prompt. Keep all three.</w:t>
+      </w:r>
+    </w:p>
+    <w:p>
+      <w:pPr>
+        <w:pStyle w:val="Compact"/>
+        <w:numPr>
+          <w:ilvl w:val="0"/>
+          <w:numId w:val="1005"/>
+        </w:numPr>
+      </w:pPr>
+      <w:r>
+        <w:t xml:space="preserve">If any run failed a constraint, change your prompt once, run it three times again, and keep those too.</w:t>
       </w:r>
     </w:p>
     <w:p>
@@ -1026,12 +1084,13 @@
         <w:tblLook w:firstRow="1" w:lastRow="0" w:firstColumn="0" w:lastColumn="0" w:noHBand="0" w:noVBand="0" w:val="0020"/>
       </w:tblPr>
       <w:tblGrid>
-        <w:gridCol w:w="1320"/>
-        <w:gridCol w:w="1320"/>
-        <w:gridCol w:w="1320"/>
-        <w:gridCol w:w="1320"/>
-        <w:gridCol w:w="1320"/>
-        <w:gridCol w:w="1320"/>
+        <w:gridCol w:w="1131"/>
+        <w:gridCol w:w="1131"/>
+        <w:gridCol w:w="1131"/>
+        <w:gridCol w:w="1131"/>
+        <w:gridCol w:w="1131"/>
+        <w:gridCol w:w="1131"/>
+        <w:gridCol w:w="1131"/>
       </w:tblGrid>
       <w:tr>
         <w:trPr>
@@ -1045,7 +1104,7 @@
               <w:jc w:val="center"/>
             </w:pPr>
             <w:r>
-              <w:t xml:space="preserve">Attempt</w:t>
+              <w:t xml:space="preserve">Run</w:t>
             </w:r>
           </w:p>
         </w:tc>
@@ -1069,13 +1128,25 @@
               <w:jc w:val="center"/>
             </w:pPr>
             <w:r>
-              <w:t xml:space="preserve">Letter</w:t>
+              <w:t xml:space="preserve">“e”</w:t>
             </w:r>
             <w:r>
               <w:t xml:space="preserve"> </w:t>
             </w:r>
             <w:r>
-              <w:t xml:space="preserve">“e”</w:t>
+              <w:t xml:space="preserve">present?</w:t>
+            </w:r>
+          </w:p>
+        </w:tc>
+        <w:tc>
+          <w:tcPr/>
+          <w:p>
+            <w:pPr>
+              <w:pStyle w:val="Compact"/>
+              <w:jc w:val="center"/>
+            </w:pPr>
+            <w:r>
+              <w:t xml:space="preserve">“a”</w:t>
             </w:r>
             <w:r>
               <w:t xml:space="preserve"> </w:t>
@@ -1123,7 +1194,7 @@
               <w:jc w:val="center"/>
             </w:pPr>
             <w:r>
-              <w:t xml:space="preserve">Constraints met (out of 4)</w:t>
+              <w:t xml:space="preserve">Constraints met (out of 5)</w:t>
             </w:r>
           </w:p>
         </w:tc>
@@ -1181,6 +1252,14 @@
             </w:pPr>
           </w:p>
         </w:tc>
+        <w:tc>
+          <w:tcPr/>
+          <w:p>
+            <w:pPr>
+              <w:pStyle w:val="Compact"/>
+            </w:pPr>
+          </w:p>
+        </w:tc>
       </w:tr>
       <w:tr>
         <w:tc>
@@ -1235,6 +1314,14 @@
             </w:pPr>
           </w:p>
         </w:tc>
+        <w:tc>
+          <w:tcPr/>
+          <w:p>
+            <w:pPr>
+              <w:pStyle w:val="Compact"/>
+            </w:pPr>
+          </w:p>
+        </w:tc>
       </w:tr>
       <w:tr>
         <w:tc>
@@ -1289,6 +1376,14 @@
             </w:pPr>
           </w:p>
         </w:tc>
+        <w:tc>
+          <w:tcPr/>
+          <w:p>
+            <w:pPr>
+              <w:pStyle w:val="Compact"/>
+            </w:pPr>
+          </w:p>
+        </w:tc>
       </w:tr>
     </w:tbl>
     <w:p>
@@ -1312,7 +1407,7 @@
         </w:numPr>
       </w:pPr>
       <w:r>
-        <w:t xml:space="preserve">Which constraint failed most often? Why do you think that one is hard for a model that predicts one token at a time (Lecture 10)?</w:t>
+        <w:t xml:space="preserve">Did the three runs give the same result? If not, what differed? The same prompt does not always give the same output (Lecture 06 covered temperature)</w:t>
       </w:r>
     </w:p>
     <w:p>
@@ -1324,7 +1419,7 @@
         </w:numPr>
       </w:pPr>
       <w:r>
-        <w:t xml:space="preserve">What did you change between attempts, and which change helped most?</w:t>
+        <w:t xml:space="preserve">Which constraint failed, if any? Why might that one be hard for a model that predicts one token at a time (Lecture 10)?</w:t>
       </w:r>
     </w:p>
     <w:p>
@@ -1336,28 +1431,7 @@
         </w:numPr>
       </w:pPr>
       <w:r>
-        <w:t xml:space="preserve">If all four passed on the first attempt, make the task harder (30 words, or no</w:t>
-      </w:r>
-      <w:r>
-        <w:t xml:space="preserve"> </w:t>
-      </w:r>
-      <w:r>
-        <w:t xml:space="preserve">“e”</w:t>
-      </w:r>
-      <w:r>
-        <w:t xml:space="preserve"> </w:t>
-      </w:r>
-      <w:r>
-        <w:t xml:space="preserve">and no</w:t>
-      </w:r>
-      <w:r>
-        <w:t xml:space="preserve"> </w:t>
-      </w:r>
-      <w:r>
-        <w:t xml:space="preserve">“a”</w:t>
-      </w:r>
-      <w:r>
-        <w:t xml:space="preserve">) and report that instead</w:t>
+        <w:t xml:space="preserve">If all three runs passed every constraint, say which constraint you would add to make it fail, and test it once</w:t>
       </w:r>
     </w:p>
     <w:p>
@@ -1562,7 +1636,7 @@
         <w:t xml:space="preserve">three new chats</w:t>
       </w:r>
       <w:r>
-        <w:t xml:space="preserve">. In each, run one version (V0, V1, V2) followed by the task description. Copy the first 150 words of each output.</w:t>
+        <w:t xml:space="preserve">. In the first, send V0 on its own, with nothing else: this is what the model gets when you skip the details. In the second, send V1 followed by the task description. In the third, send V2 followed by the task description. Copy the first 150 words of each output.</w:t>
       </w:r>
     </w:p>
     <w:p>
@@ -1811,7 +1885,7 @@
         </w:numPr>
       </w:pPr>
       <w:r>
-        <w:t xml:space="preserve">Report the three scores. Where did the biggest jump happen, V0 to V1 or V1 to V2?</w:t>
+        <w:t xml:space="preserve">Report the three scores. What did the model do with V0 alone: guess a topic, ask you questions, or produce something generic? Where did the biggest jump happen, V0 to V1 or V1 to V2?</w:t>
       </w:r>
     </w:p>
     <w:p>

</xml_diff>